<commit_message>
Add extended 21-slide Module 2 presentation
Covers antenna, slot and hybrid-slotted DGS basics, why AI helps (with
measured prediction speed), the input features, the seven pipeline stages
mapped to the classic text-AI stages, every executed output and the value
for engineers. Each content slide has a note bubble and speaker notes.
Adds illustrative antenna schematics and a timing script.

Co-Authored-By: Claude Opus 5.5 <noreply@anthropic.com>
</commit_message>
<xml_diff>
--- a/reports/module2_report.docx
+++ b/reports/module2_report.docx
@@ -235,7 +235,7 @@
       <w:pPr>
         <w:pStyle w:val="Heading1"/>
       </w:pPr>
-      <w:bookmarkStart w:id="0" w:name="_Toc243940084"/>
+      <w:bookmarkStart w:id="0" w:name="_Toc244097961"/>
       <w:r>
         <w:lastRenderedPageBreak/>
         <w:t>Table of Contents</w:t>
@@ -266,7 +266,7 @@
       <w:r>
         <w:fldChar w:fldCharType="separate"/>
       </w:r>
-      <w:hyperlink w:anchor="_Toc243940084" w:history="1">
+      <w:hyperlink w:anchor="_Toc244097961" w:history="1">
         <w:r>
           <w:rPr>
             <w:rStyle w:val="Hyperlink"/>
@@ -293,7 +293,7 @@
             <w:noProof/>
             <w:webHidden/>
           </w:rPr>
-          <w:instrText xml:space="preserve"> PAGEREF _Toc243940084 \h </w:instrText>
+          <w:instrText xml:space="preserve"> PAGEREF _Toc244097961 \h </w:instrText>
         </w:r>
         <w:r>
           <w:rPr>
@@ -339,7 +339,7 @@
           <w14:ligatures w14:val="standardContextual"/>
         </w:rPr>
       </w:pPr>
-      <w:hyperlink w:anchor="_Toc243940085" w:history="1">
+      <w:hyperlink w:anchor="_Toc244097962" w:history="1">
         <w:r>
           <w:rPr>
             <w:rStyle w:val="Hyperlink"/>
@@ -366,7 +366,7 @@
             <w:noProof/>
             <w:webHidden/>
           </w:rPr>
-          <w:instrText xml:space="preserve"> PAGEREF _Toc243940085 \h </w:instrText>
+          <w:instrText xml:space="preserve"> PAGEREF _Toc244097962 \h </w:instrText>
         </w:r>
         <w:r>
           <w:rPr>
@@ -412,7 +412,7 @@
           <w14:ligatures w14:val="standardContextual"/>
         </w:rPr>
       </w:pPr>
-      <w:hyperlink w:anchor="_Toc243940086" w:history="1">
+      <w:hyperlink w:anchor="_Toc244097963" w:history="1">
         <w:r>
           <w:rPr>
             <w:rStyle w:val="Hyperlink"/>
@@ -439,7 +439,7 @@
             <w:noProof/>
             <w:webHidden/>
           </w:rPr>
-          <w:instrText xml:space="preserve"> PAGEREF _Toc243940086 \h </w:instrText>
+          <w:instrText xml:space="preserve"> PAGEREF _Toc244097963 \h </w:instrText>
         </w:r>
         <w:r>
           <w:rPr>
@@ -485,7 +485,7 @@
           <w14:ligatures w14:val="standardContextual"/>
         </w:rPr>
       </w:pPr>
-      <w:hyperlink w:anchor="_Toc243940087" w:history="1">
+      <w:hyperlink w:anchor="_Toc244097964" w:history="1">
         <w:r>
           <w:rPr>
             <w:rStyle w:val="Hyperlink"/>
@@ -512,7 +512,7 @@
             <w:noProof/>
             <w:webHidden/>
           </w:rPr>
-          <w:instrText xml:space="preserve"> PAGEREF _Toc243940087 \h </w:instrText>
+          <w:instrText xml:space="preserve"> PAGEREF _Toc244097964 \h </w:instrText>
         </w:r>
         <w:r>
           <w:rPr>
@@ -558,7 +558,7 @@
           <w14:ligatures w14:val="standardContextual"/>
         </w:rPr>
       </w:pPr>
-      <w:hyperlink w:anchor="_Toc243940088" w:history="1">
+      <w:hyperlink w:anchor="_Toc244097965" w:history="1">
         <w:r>
           <w:rPr>
             <w:rStyle w:val="Hyperlink"/>
@@ -585,7 +585,7 @@
             <w:noProof/>
             <w:webHidden/>
           </w:rPr>
-          <w:instrText xml:space="preserve"> PAGEREF _Toc243940088 \h </w:instrText>
+          <w:instrText xml:space="preserve"> PAGEREF _Toc244097965 \h </w:instrText>
         </w:r>
         <w:r>
           <w:rPr>
@@ -631,7 +631,7 @@
           <w14:ligatures w14:val="standardContextual"/>
         </w:rPr>
       </w:pPr>
-      <w:hyperlink w:anchor="_Toc243940089" w:history="1">
+      <w:hyperlink w:anchor="_Toc244097966" w:history="1">
         <w:r>
           <w:rPr>
             <w:rStyle w:val="Hyperlink"/>
@@ -658,7 +658,7 @@
             <w:noProof/>
             <w:webHidden/>
           </w:rPr>
-          <w:instrText xml:space="preserve"> PAGEREF _Toc243940089 \h </w:instrText>
+          <w:instrText xml:space="preserve"> PAGEREF _Toc244097966 \h </w:instrText>
         </w:r>
         <w:r>
           <w:rPr>
@@ -704,7 +704,7 @@
           <w14:ligatures w14:val="standardContextual"/>
         </w:rPr>
       </w:pPr>
-      <w:hyperlink w:anchor="_Toc243940090" w:history="1">
+      <w:hyperlink w:anchor="_Toc244097967" w:history="1">
         <w:r>
           <w:rPr>
             <w:rStyle w:val="Hyperlink"/>
@@ -731,7 +731,7 @@
             <w:noProof/>
             <w:webHidden/>
           </w:rPr>
-          <w:instrText xml:space="preserve"> PAGEREF _Toc243940090 \h </w:instrText>
+          <w:instrText xml:space="preserve"> PAGEREF _Toc244097967 \h </w:instrText>
         </w:r>
         <w:r>
           <w:rPr>
@@ -777,7 +777,7 @@
           <w14:ligatures w14:val="standardContextual"/>
         </w:rPr>
       </w:pPr>
-      <w:hyperlink w:anchor="_Toc243940091" w:history="1">
+      <w:hyperlink w:anchor="_Toc244097968" w:history="1">
         <w:r>
           <w:rPr>
             <w:rStyle w:val="Hyperlink"/>
@@ -804,7 +804,7 @@
             <w:noProof/>
             <w:webHidden/>
           </w:rPr>
-          <w:instrText xml:space="preserve"> PAGEREF _Toc243940091 \h </w:instrText>
+          <w:instrText xml:space="preserve"> PAGEREF _Toc244097968 \h </w:instrText>
         </w:r>
         <w:r>
           <w:rPr>
@@ -850,7 +850,7 @@
           <w14:ligatures w14:val="standardContextual"/>
         </w:rPr>
       </w:pPr>
-      <w:hyperlink w:anchor="_Toc243940092" w:history="1">
+      <w:hyperlink w:anchor="_Toc244097969" w:history="1">
         <w:r>
           <w:rPr>
             <w:rStyle w:val="Hyperlink"/>
@@ -877,7 +877,7 @@
             <w:noProof/>
             <w:webHidden/>
           </w:rPr>
-          <w:instrText xml:space="preserve"> PAGEREF _Toc243940092 \h </w:instrText>
+          <w:instrText xml:space="preserve"> PAGEREF _Toc244097969 \h </w:instrText>
         </w:r>
         <w:r>
           <w:rPr>
@@ -923,7 +923,7 @@
           <w14:ligatures w14:val="standardContextual"/>
         </w:rPr>
       </w:pPr>
-      <w:hyperlink w:anchor="_Toc243940093" w:history="1">
+      <w:hyperlink w:anchor="_Toc244097970" w:history="1">
         <w:r>
           <w:rPr>
             <w:rStyle w:val="Hyperlink"/>
@@ -950,7 +950,7 @@
             <w:noProof/>
             <w:webHidden/>
           </w:rPr>
-          <w:instrText xml:space="preserve"> PAGEREF _Toc243940093 \h </w:instrText>
+          <w:instrText xml:space="preserve"> PAGEREF _Toc244097970 \h </w:instrText>
         </w:r>
         <w:r>
           <w:rPr>
@@ -996,7 +996,7 @@
           <w14:ligatures w14:val="standardContextual"/>
         </w:rPr>
       </w:pPr>
-      <w:hyperlink w:anchor="_Toc243940094" w:history="1">
+      <w:hyperlink w:anchor="_Toc244097971" w:history="1">
         <w:r>
           <w:rPr>
             <w:rStyle w:val="Hyperlink"/>
@@ -1023,7 +1023,7 @@
             <w:noProof/>
             <w:webHidden/>
           </w:rPr>
-          <w:instrText xml:space="preserve"> PAGEREF _Toc243940094 \h </w:instrText>
+          <w:instrText xml:space="preserve"> PAGEREF _Toc244097971 \h </w:instrText>
         </w:r>
         <w:r>
           <w:rPr>
@@ -1069,7 +1069,7 @@
           <w14:ligatures w14:val="standardContextual"/>
         </w:rPr>
       </w:pPr>
-      <w:hyperlink w:anchor="_Toc243940095" w:history="1">
+      <w:hyperlink w:anchor="_Toc244097972" w:history="1">
         <w:r>
           <w:rPr>
             <w:rStyle w:val="Hyperlink"/>
@@ -1096,7 +1096,7 @@
             <w:noProof/>
             <w:webHidden/>
           </w:rPr>
-          <w:instrText xml:space="preserve"> PAGEREF _Toc243940095 \h </w:instrText>
+          <w:instrText xml:space="preserve"> PAGEREF _Toc244097972 \h </w:instrText>
         </w:r>
         <w:r>
           <w:rPr>
@@ -1142,7 +1142,7 @@
           <w14:ligatures w14:val="standardContextual"/>
         </w:rPr>
       </w:pPr>
-      <w:hyperlink w:anchor="_Toc243940096" w:history="1">
+      <w:hyperlink w:anchor="_Toc244097973" w:history="1">
         <w:r>
           <w:rPr>
             <w:rStyle w:val="Hyperlink"/>
@@ -1169,7 +1169,7 @@
             <w:noProof/>
             <w:webHidden/>
           </w:rPr>
-          <w:instrText xml:space="preserve"> PAGEREF _Toc243940096 \h </w:instrText>
+          <w:instrText xml:space="preserve"> PAGEREF _Toc244097973 \h </w:instrText>
         </w:r>
         <w:r>
           <w:rPr>
@@ -1215,7 +1215,7 @@
           <w14:ligatures w14:val="standardContextual"/>
         </w:rPr>
       </w:pPr>
-      <w:hyperlink w:anchor="_Toc243940097" w:history="1">
+      <w:hyperlink w:anchor="_Toc244097974" w:history="1">
         <w:r>
           <w:rPr>
             <w:rStyle w:val="Hyperlink"/>
@@ -1242,7 +1242,7 @@
             <w:noProof/>
             <w:webHidden/>
           </w:rPr>
-          <w:instrText xml:space="preserve"> PAGEREF _Toc243940097 \h </w:instrText>
+          <w:instrText xml:space="preserve"> PAGEREF _Toc244097974 \h </w:instrText>
         </w:r>
         <w:r>
           <w:rPr>
@@ -1288,7 +1288,7 @@
           <w14:ligatures w14:val="standardContextual"/>
         </w:rPr>
       </w:pPr>
-      <w:hyperlink w:anchor="_Toc243940098" w:history="1">
+      <w:hyperlink w:anchor="_Toc244097975" w:history="1">
         <w:r>
           <w:rPr>
             <w:rStyle w:val="Hyperlink"/>
@@ -1315,7 +1315,7 @@
             <w:noProof/>
             <w:webHidden/>
           </w:rPr>
-          <w:instrText xml:space="preserve"> PAGEREF _Toc243940098 \h </w:instrText>
+          <w:instrText xml:space="preserve"> PAGEREF _Toc244097975 \h </w:instrText>
         </w:r>
         <w:r>
           <w:rPr>
@@ -1361,7 +1361,7 @@
           <w14:ligatures w14:val="standardContextual"/>
         </w:rPr>
       </w:pPr>
-      <w:hyperlink w:anchor="_Toc243940099" w:history="1">
+      <w:hyperlink w:anchor="_Toc244097976" w:history="1">
         <w:r>
           <w:rPr>
             <w:rStyle w:val="Hyperlink"/>
@@ -1388,7 +1388,7 @@
             <w:noProof/>
             <w:webHidden/>
           </w:rPr>
-          <w:instrText xml:space="preserve"> PAGEREF _Toc243940099 \h </w:instrText>
+          <w:instrText xml:space="preserve"> PAGEREF _Toc244097976 \h </w:instrText>
         </w:r>
         <w:r>
           <w:rPr>
@@ -1434,7 +1434,7 @@
           <w14:ligatures w14:val="standardContextual"/>
         </w:rPr>
       </w:pPr>
-      <w:hyperlink w:anchor="_Toc243940100" w:history="1">
+      <w:hyperlink w:anchor="_Toc244097977" w:history="1">
         <w:r>
           <w:rPr>
             <w:rStyle w:val="Hyperlink"/>
@@ -1461,7 +1461,7 @@
             <w:noProof/>
             <w:webHidden/>
           </w:rPr>
-          <w:instrText xml:space="preserve"> PAGEREF _Toc243940100 \h </w:instrText>
+          <w:instrText xml:space="preserve"> PAGEREF _Toc244097977 \h </w:instrText>
         </w:r>
         <w:r>
           <w:rPr>
@@ -1507,7 +1507,7 @@
           <w14:ligatures w14:val="standardContextual"/>
         </w:rPr>
       </w:pPr>
-      <w:hyperlink w:anchor="_Toc243940101" w:history="1">
+      <w:hyperlink w:anchor="_Toc244097978" w:history="1">
         <w:r>
           <w:rPr>
             <w:rStyle w:val="Hyperlink"/>
@@ -1534,7 +1534,7 @@
             <w:noProof/>
             <w:webHidden/>
           </w:rPr>
-          <w:instrText xml:space="preserve"> PAGEREF _Toc243940101 \h </w:instrText>
+          <w:instrText xml:space="preserve"> PAGEREF _Toc244097978 \h </w:instrText>
         </w:r>
         <w:r>
           <w:rPr>
@@ -1580,7 +1580,7 @@
           <w14:ligatures w14:val="standardContextual"/>
         </w:rPr>
       </w:pPr>
-      <w:hyperlink w:anchor="_Toc243940102" w:history="1">
+      <w:hyperlink w:anchor="_Toc244097979" w:history="1">
         <w:r>
           <w:rPr>
             <w:rStyle w:val="Hyperlink"/>
@@ -1607,7 +1607,7 @@
             <w:noProof/>
             <w:webHidden/>
           </w:rPr>
-          <w:instrText xml:space="preserve"> PAGEREF _Toc243940102 \h </w:instrText>
+          <w:instrText xml:space="preserve"> PAGEREF _Toc244097979 \h </w:instrText>
         </w:r>
         <w:r>
           <w:rPr>
@@ -1653,7 +1653,7 @@
           <w14:ligatures w14:val="standardContextual"/>
         </w:rPr>
       </w:pPr>
-      <w:hyperlink w:anchor="_Toc243940103" w:history="1">
+      <w:hyperlink w:anchor="_Toc244097980" w:history="1">
         <w:r>
           <w:rPr>
             <w:rStyle w:val="Hyperlink"/>
@@ -1680,7 +1680,7 @@
             <w:noProof/>
             <w:webHidden/>
           </w:rPr>
-          <w:instrText xml:space="preserve"> PAGEREF _Toc243940103 \h </w:instrText>
+          <w:instrText xml:space="preserve"> PAGEREF _Toc244097980 \h </w:instrText>
         </w:r>
         <w:r>
           <w:rPr>
@@ -1726,7 +1726,7 @@
           <w14:ligatures w14:val="standardContextual"/>
         </w:rPr>
       </w:pPr>
-      <w:hyperlink w:anchor="_Toc243940104" w:history="1">
+      <w:hyperlink w:anchor="_Toc244097981" w:history="1">
         <w:r>
           <w:rPr>
             <w:rStyle w:val="Hyperlink"/>
@@ -1753,7 +1753,7 @@
             <w:noProof/>
             <w:webHidden/>
           </w:rPr>
-          <w:instrText xml:space="preserve"> PAGEREF _Toc243940104 \h </w:instrText>
+          <w:instrText xml:space="preserve"> PAGEREF _Toc244097981 \h </w:instrText>
         </w:r>
         <w:r>
           <w:rPr>
@@ -1799,7 +1799,7 @@
           <w14:ligatures w14:val="standardContextual"/>
         </w:rPr>
       </w:pPr>
-      <w:hyperlink w:anchor="_Toc243940105" w:history="1">
+      <w:hyperlink w:anchor="_Toc244097982" w:history="1">
         <w:r>
           <w:rPr>
             <w:rStyle w:val="Hyperlink"/>
@@ -1826,7 +1826,7 @@
             <w:noProof/>
             <w:webHidden/>
           </w:rPr>
-          <w:instrText xml:space="preserve"> PAGEREF _Toc243940105 \h </w:instrText>
+          <w:instrText xml:space="preserve"> PAGEREF _Toc244097982 \h </w:instrText>
         </w:r>
         <w:r>
           <w:rPr>
@@ -1872,7 +1872,7 @@
           <w14:ligatures w14:val="standardContextual"/>
         </w:rPr>
       </w:pPr>
-      <w:hyperlink w:anchor="_Toc243940106" w:history="1">
+      <w:hyperlink w:anchor="_Toc244097983" w:history="1">
         <w:r>
           <w:rPr>
             <w:rStyle w:val="Hyperlink"/>
@@ -1899,7 +1899,7 @@
             <w:noProof/>
             <w:webHidden/>
           </w:rPr>
-          <w:instrText xml:space="preserve"> PAGEREF _Toc243940106 \h </w:instrText>
+          <w:instrText xml:space="preserve"> PAGEREF _Toc244097983 \h </w:instrText>
         </w:r>
         <w:r>
           <w:rPr>
@@ -1945,7 +1945,7 @@
           <w14:ligatures w14:val="standardContextual"/>
         </w:rPr>
       </w:pPr>
-      <w:hyperlink w:anchor="_Toc243940107" w:history="1">
+      <w:hyperlink w:anchor="_Toc244097984" w:history="1">
         <w:r>
           <w:rPr>
             <w:rStyle w:val="Hyperlink"/>
@@ -1972,7 +1972,7 @@
             <w:noProof/>
             <w:webHidden/>
           </w:rPr>
-          <w:instrText xml:space="preserve"> PAGEREF _Toc243940107 \h </w:instrText>
+          <w:instrText xml:space="preserve"> PAGEREF _Toc244097984 \h </w:instrText>
         </w:r>
         <w:r>
           <w:rPr>
@@ -2018,7 +2018,7 @@
           <w14:ligatures w14:val="standardContextual"/>
         </w:rPr>
       </w:pPr>
-      <w:hyperlink w:anchor="_Toc243940108" w:history="1">
+      <w:hyperlink w:anchor="_Toc244097985" w:history="1">
         <w:r>
           <w:rPr>
             <w:rStyle w:val="Hyperlink"/>
@@ -2045,7 +2045,7 @@
             <w:noProof/>
             <w:webHidden/>
           </w:rPr>
-          <w:instrText xml:space="preserve"> PAGEREF _Toc243940108 \h </w:instrText>
+          <w:instrText xml:space="preserve"> PAGEREF _Toc244097985 \h </w:instrText>
         </w:r>
         <w:r>
           <w:rPr>
@@ -2091,7 +2091,7 @@
           <w14:ligatures w14:val="standardContextual"/>
         </w:rPr>
       </w:pPr>
-      <w:hyperlink w:anchor="_Toc243940109" w:history="1">
+      <w:hyperlink w:anchor="_Toc244097986" w:history="1">
         <w:r>
           <w:rPr>
             <w:rStyle w:val="Hyperlink"/>
@@ -2118,7 +2118,7 @@
             <w:noProof/>
             <w:webHidden/>
           </w:rPr>
-          <w:instrText xml:space="preserve"> PAGEREF _Toc243940109 \h </w:instrText>
+          <w:instrText xml:space="preserve"> PAGEREF _Toc244097986 \h </w:instrText>
         </w:r>
         <w:r>
           <w:rPr>
@@ -2164,7 +2164,7 @@
           <w14:ligatures w14:val="standardContextual"/>
         </w:rPr>
       </w:pPr>
-      <w:hyperlink w:anchor="_Toc243940110" w:history="1">
+      <w:hyperlink w:anchor="_Toc244097987" w:history="1">
         <w:r>
           <w:rPr>
             <w:rStyle w:val="Hyperlink"/>
@@ -2191,7 +2191,7 @@
             <w:noProof/>
             <w:webHidden/>
           </w:rPr>
-          <w:instrText xml:space="preserve"> PAGEREF _Toc243940110 \h </w:instrText>
+          <w:instrText xml:space="preserve"> PAGEREF _Toc244097987 \h </w:instrText>
         </w:r>
         <w:r>
           <w:rPr>
@@ -2237,7 +2237,7 @@
           <w14:ligatures w14:val="standardContextual"/>
         </w:rPr>
       </w:pPr>
-      <w:hyperlink w:anchor="_Toc243940111" w:history="1">
+      <w:hyperlink w:anchor="_Toc244097988" w:history="1">
         <w:r>
           <w:rPr>
             <w:rStyle w:val="Hyperlink"/>
@@ -2264,7 +2264,7 @@
             <w:noProof/>
             <w:webHidden/>
           </w:rPr>
-          <w:instrText xml:space="preserve"> PAGEREF _Toc243940111 \h </w:instrText>
+          <w:instrText xml:space="preserve"> PAGEREF _Toc244097988 \h </w:instrText>
         </w:r>
         <w:r>
           <w:rPr>
@@ -2310,7 +2310,7 @@
           <w14:ligatures w14:val="standardContextual"/>
         </w:rPr>
       </w:pPr>
-      <w:hyperlink w:anchor="_Toc243940112" w:history="1">
+      <w:hyperlink w:anchor="_Toc244097989" w:history="1">
         <w:r>
           <w:rPr>
             <w:rStyle w:val="Hyperlink"/>
@@ -2337,7 +2337,7 @@
             <w:noProof/>
             <w:webHidden/>
           </w:rPr>
-          <w:instrText xml:space="preserve"> PAGEREF _Toc243940112 \h </w:instrText>
+          <w:instrText xml:space="preserve"> PAGEREF _Toc244097989 \h </w:instrText>
         </w:r>
         <w:r>
           <w:rPr>
@@ -2382,7 +2382,7 @@
       <w:pPr>
         <w:pStyle w:val="Heading1"/>
       </w:pPr>
-      <w:bookmarkStart w:id="1" w:name="_Toc243940085"/>
+      <w:bookmarkStart w:id="1" w:name="_Toc244097962"/>
       <w:r>
         <w:lastRenderedPageBreak/>
         <w:t>Abstract</w:t>
@@ -2424,7 +2424,7 @@
       <w:pPr>
         <w:pStyle w:val="Heading1"/>
       </w:pPr>
-      <w:bookmarkStart w:id="2" w:name="_Toc243940086"/>
+      <w:bookmarkStart w:id="2" w:name="_Toc244097963"/>
       <w:r>
         <w:t>1. Introduction and Recap of the Research Problem</w:t>
       </w:r>
@@ -3207,7 +3207,7 @@
           <w:noProof/>
         </w:rPr>
         <w:drawing>
-          <wp:inline distT="0" distB="0" distL="0" distR="0">
+          <wp:inline distT="0" distB="0" distL="0" distR="0" wp14:anchorId="638EAC12" wp14:editId="736C0E38">
             <wp:extent cx="5760720" cy="2915696"/>
             <wp:effectExtent l="0" t="0" r="0" b="0"/>
             <wp:docPr id="1" name="Picture 1"/>
@@ -3256,7 +3256,7 @@
       <w:pPr>
         <w:pStyle w:val="Heading1"/>
       </w:pPr>
-      <w:bookmarkStart w:id="3" w:name="_Toc243940087"/>
+      <w:bookmarkStart w:id="3" w:name="_Toc244097964"/>
       <w:r>
         <w:lastRenderedPageBreak/>
         <w:t>2. Research Design and Hypotheses</w:t>
@@ -3696,7 +3696,7 @@
       <w:pPr>
         <w:pStyle w:val="Heading1"/>
       </w:pPr>
-      <w:bookmarkStart w:id="4" w:name="_Toc243940088"/>
+      <w:bookmarkStart w:id="4" w:name="_Toc244097965"/>
       <w:r>
         <w:t>3. Dataset Description and Source Verification</w:t>
       </w:r>
@@ -4121,7 +4121,7 @@
       <w:pPr>
         <w:pStyle w:val="Heading1"/>
       </w:pPr>
-      <w:bookmarkStart w:id="5" w:name="_Toc243940089"/>
+      <w:bookmarkStart w:id="5" w:name="_Toc244097966"/>
       <w:r>
         <w:t>4. Data Preprocessing and Preparation</w:t>
       </w:r>
@@ -4131,7 +4131,7 @@
       <w:pPr>
         <w:pStyle w:val="Heading2"/>
       </w:pPr>
-      <w:bookmarkStart w:id="6" w:name="_Toc243940090"/>
+      <w:bookmarkStart w:id="6" w:name="_Toc244097967"/>
       <w:r>
         <w:t>4.1 Engineering targets from simulated S11</w:t>
       </w:r>
@@ -4177,7 +4177,7 @@
         </w:rPr>
         <w:lastRenderedPageBreak/>
         <w:drawing>
-          <wp:inline distT="0" distB="0" distL="0" distR="0">
+          <wp:inline distT="0" distB="0" distL="0" distR="0" wp14:anchorId="136A78D3" wp14:editId="76AA0181">
             <wp:extent cx="5486400" cy="2590800"/>
             <wp:effectExtent l="0" t="0" r="0" b="0"/>
             <wp:docPr id="2" name="Picture 2"/>
@@ -4226,7 +4226,7 @@
       <w:pPr>
         <w:pStyle w:val="Heading2"/>
       </w:pPr>
-      <w:bookmarkStart w:id="7" w:name="_Toc243940091"/>
+      <w:bookmarkStart w:id="7" w:name="_Toc244097968"/>
       <w:r>
         <w:t>4.2 Cleaning and plausibility rules</w:t>
       </w:r>
@@ -4260,7 +4260,7 @@
       <w:pPr>
         <w:pStyle w:val="Heading2"/>
       </w:pPr>
-      <w:bookmarkStart w:id="8" w:name="_Toc243940092"/>
+      <w:bookmarkStart w:id="8" w:name="_Toc244097969"/>
       <w:r>
         <w:t>4.3 Features, split and leakage control</w:t>
       </w:r>
@@ -4354,7 +4354,7 @@
       <w:pPr>
         <w:pStyle w:val="Heading1"/>
       </w:pPr>
-      <w:bookmarkStart w:id="9" w:name="_Toc243940093"/>
+      <w:bookmarkStart w:id="9" w:name="_Toc244097970"/>
       <w:r>
         <w:lastRenderedPageBreak/>
         <w:t>5. Proposed Model: Numerical-Text Surrogate, Fusion and Optimisation</w:t>
@@ -4427,7 +4427,7 @@
       <w:pPr>
         <w:pStyle w:val="Heading1"/>
       </w:pPr>
-      <w:bookmarkStart w:id="10" w:name="_Toc243940094"/>
+      <w:bookmarkStart w:id="10" w:name="_Toc244097971"/>
       <w:r>
         <w:lastRenderedPageBreak/>
         <w:t>6. Training Strategy and Experimental Setup</w:t>
@@ -4968,7 +4968,7 @@
       <w:pPr>
         <w:pStyle w:val="Heading1"/>
       </w:pPr>
-      <w:bookmarkStart w:id="11" w:name="_Toc243940095"/>
+      <w:bookmarkStart w:id="11" w:name="_Toc244097972"/>
       <w:r>
         <w:t>7. Baseline Methods and Comparative Models</w:t>
       </w:r>
@@ -5062,7 +5062,7 @@
       <w:pPr>
         <w:pStyle w:val="Heading1"/>
       </w:pPr>
-      <w:bookmarkStart w:id="12" w:name="_Toc243940096"/>
+      <w:bookmarkStart w:id="12" w:name="_Toc244097973"/>
       <w:r>
         <w:t>8. Evaluation Metrics and Analysis Plan</w:t>
       </w:r>
@@ -5083,7 +5083,7 @@
       <w:pPr>
         <w:pStyle w:val="Heading1"/>
       </w:pPr>
-      <w:bookmarkStart w:id="13" w:name="_Toc243940097"/>
+      <w:bookmarkStart w:id="13" w:name="_Toc244097974"/>
       <w:r>
         <w:lastRenderedPageBreak/>
         <w:t>9. Results and Discussion</w:t>
@@ -5102,7 +5102,7 @@
       <w:pPr>
         <w:pStyle w:val="Heading2"/>
       </w:pPr>
-      <w:bookmarkStart w:id="14" w:name="_Toc243940098"/>
+      <w:bookmarkStart w:id="14" w:name="_Toc244097975"/>
       <w:r>
         <w:t>9.1 Patch surrogate: resonance, matching and bandwidth (RQ1)</w:t>
       </w:r>
@@ -5756,7 +5756,7 @@
           <w:noProof/>
         </w:rPr>
         <w:drawing>
-          <wp:inline distT="0" distB="0" distL="0" distR="0">
+          <wp:inline distT="0" distB="0" distL="0" distR="0" wp14:anchorId="73089D4F" wp14:editId="2C87CBD2">
             <wp:extent cx="5760720" cy="1459382"/>
             <wp:effectExtent l="0" t="0" r="0" b="0"/>
             <wp:docPr id="3" name="Picture 3"/>
@@ -5811,7 +5811,7 @@
           <w:noProof/>
         </w:rPr>
         <w:drawing>
-          <wp:inline distT="0" distB="0" distL="0" distR="0">
+          <wp:inline distT="0" distB="0" distL="0" distR="0" wp14:anchorId="70A31552" wp14:editId="3B75E96B">
             <wp:extent cx="5760720" cy="1683903"/>
             <wp:effectExtent l="0" t="0" r="0" b="0"/>
             <wp:docPr id="4" name="Picture 4"/>
@@ -5901,7 +5901,7 @@
       <w:pPr>
         <w:pStyle w:val="Heading2"/>
       </w:pPr>
-      <w:bookmarkStart w:id="15" w:name="_Toc243940099"/>
+      <w:bookmarkStart w:id="15" w:name="_Toc244097976"/>
       <w:r>
         <w:t>9.2 Slotted patch: S11, gain and efficiency (RQ2)</w:t>
       </w:r>
@@ -7130,7 +7130,7 @@
         </w:rPr>
         <w:lastRenderedPageBreak/>
         <w:drawing>
-          <wp:inline distT="0" distB="0" distL="0" distR="0">
+          <wp:inline distT="0" distB="0" distL="0" distR="0" wp14:anchorId="358886D0" wp14:editId="51A8A457">
             <wp:extent cx="5760720" cy="1776222"/>
             <wp:effectExtent l="0" t="0" r="0" b="0"/>
             <wp:docPr id="5" name="Picture 5"/>
@@ -7199,7 +7199,7 @@
       <w:pPr>
         <w:pStyle w:val="Heading2"/>
       </w:pPr>
-      <w:bookmarkStart w:id="16" w:name="_Toc243940100"/>
+      <w:bookmarkStart w:id="16" w:name="_Toc244097977"/>
       <w:r>
         <w:t>9.3 Engineering summaries (RQ5)</w:t>
       </w:r>
@@ -7241,7 +7241,7 @@
       <w:pPr>
         <w:pStyle w:val="Heading2"/>
       </w:pPr>
-      <w:bookmarkStart w:id="17" w:name="_Toc243940101"/>
+      <w:bookmarkStart w:id="17" w:name="_Toc244097978"/>
       <w:r>
         <w:lastRenderedPageBreak/>
         <w:t>9.4 Multimodal fusion (RQ3, H6)</w:t>
@@ -7765,7 +7765,7 @@
           <w:noProof/>
         </w:rPr>
         <w:drawing>
-          <wp:inline distT="0" distB="0" distL="0" distR="0">
+          <wp:inline distT="0" distB="0" distL="0" distR="0" wp14:anchorId="4DB58215" wp14:editId="474C4FB9">
             <wp:extent cx="5486400" cy="1778000"/>
             <wp:effectExtent l="0" t="0" r="0" b="0"/>
             <wp:docPr id="6" name="Picture 6"/>
@@ -7834,7 +7834,7 @@
       <w:pPr>
         <w:pStyle w:val="Heading2"/>
       </w:pPr>
-      <w:bookmarkStart w:id="18" w:name="_Toc243940102"/>
+      <w:bookmarkStart w:id="18" w:name="_Toc244097979"/>
       <w:r>
         <w:lastRenderedPageBreak/>
         <w:t>9.5 NSGA-II surrogate optimisation for NR n78 (RQ4)</w:t>
@@ -7851,7 +7851,7 @@
           <w:noProof/>
         </w:rPr>
         <w:drawing>
-          <wp:inline distT="0" distB="0" distL="0" distR="0">
+          <wp:inline distT="0" distB="0" distL="0" distR="0" wp14:anchorId="559B3BDB" wp14:editId="3F541D9F">
             <wp:extent cx="4389120" cy="2948940"/>
             <wp:effectExtent l="0" t="0" r="0" b="0"/>
             <wp:docPr id="7" name="Picture 7"/>
@@ -8434,7 +8434,7 @@
       <w:pPr>
         <w:pStyle w:val="Heading2"/>
       </w:pPr>
-      <w:bookmarkStart w:id="19" w:name="_Toc243940103"/>
+      <w:bookmarkStart w:id="19" w:name="_Toc244097980"/>
       <w:r>
         <w:t>9.6 Summary of hypotheses and evaluation criteria</w:t>
       </w:r>
@@ -8744,7 +8744,7 @@
       <w:pPr>
         <w:pStyle w:val="Heading1"/>
       </w:pPr>
-      <w:bookmarkStart w:id="20" w:name="_Toc243940104"/>
+      <w:bookmarkStart w:id="20" w:name="_Toc244097981"/>
       <w:r>
         <w:t>10. Ethics, Bias, Privacy, and Reproducibility</w:t>
       </w:r>
@@ -8816,7 +8816,7 @@
       <w:pPr>
         <w:pStyle w:val="Heading1"/>
       </w:pPr>
-      <w:bookmarkStart w:id="21" w:name="_Toc243940105"/>
+      <w:bookmarkStart w:id="21" w:name="_Toc244097982"/>
       <w:r>
         <w:lastRenderedPageBreak/>
         <w:t>11. Limitations and Future Work</w:t>
@@ -8928,7 +8928,7 @@
       <w:pPr>
         <w:pStyle w:val="Heading1"/>
       </w:pPr>
-      <w:bookmarkStart w:id="22" w:name="_Toc243940106"/>
+      <w:bookmarkStart w:id="22" w:name="_Toc244097983"/>
       <w:r>
         <w:t>12. Conclusion</w:t>
       </w:r>
@@ -8952,7 +8952,7 @@
       <w:pPr>
         <w:pStyle w:val="Heading1"/>
       </w:pPr>
-      <w:bookmarkStart w:id="23" w:name="_Toc243940107"/>
+      <w:bookmarkStart w:id="23" w:name="_Toc244097984"/>
       <w:r>
         <w:t>Data, Code and Output Availability</w:t>
       </w:r>
@@ -10245,7 +10245,7 @@
       <w:pPr>
         <w:pStyle w:val="Heading1"/>
       </w:pPr>
-      <w:bookmarkStart w:id="24" w:name="_Toc243940108"/>
+      <w:bookmarkStart w:id="24" w:name="_Toc244097985"/>
       <w:r>
         <w:t>References</w:t>
       </w:r>
@@ -10392,7 +10392,7 @@
       <w:pPr>
         <w:pStyle w:val="Heading1"/>
       </w:pPr>
-      <w:bookmarkStart w:id="25" w:name="_Toc243940109"/>
+      <w:bookmarkStart w:id="25" w:name="_Toc244097986"/>
       <w:r>
         <w:lastRenderedPageBreak/>
         <w:t>Appendix A. Data Dictionary</w:t>
@@ -12499,7 +12499,7 @@
       <w:pPr>
         <w:pStyle w:val="Heading1"/>
       </w:pPr>
-      <w:bookmarkStart w:id="26" w:name="_Toc243940110"/>
+      <w:bookmarkStart w:id="26" w:name="_Toc244097987"/>
       <w:r>
         <w:t>Appendix B. Configuration</w:t>
       </w:r>
@@ -13015,7 +13015,7 @@
       <w:pPr>
         <w:pStyle w:val="Heading1"/>
       </w:pPr>
-      <w:bookmarkStart w:id="27" w:name="_Toc243940111"/>
+      <w:bookmarkStart w:id="27" w:name="_Toc244097988"/>
       <w:r>
         <w:t>Appendix C. Experimental Details</w:t>
       </w:r>
@@ -14788,7 +14788,7 @@
       <w:pPr>
         <w:pStyle w:val="Heading1"/>
       </w:pPr>
-      <w:bookmarkStart w:id="28" w:name="_Toc243940112"/>
+      <w:bookmarkStart w:id="28" w:name="_Toc244097989"/>
       <w:r>
         <w:t>Appendix D. Reproducibility Instructions</w:t>
       </w:r>
@@ -15176,31 +15176,31 @@
       </w:rPr>
     </w:lvl>
   </w:abstractNum>
-  <w:num w:numId="1" w16cid:durableId="1971134542">
+  <w:num w:numId="1" w16cid:durableId="1785617079">
     <w:abstractNumId w:val="8"/>
   </w:num>
-  <w:num w:numId="2" w16cid:durableId="1721395935">
+  <w:num w:numId="2" w16cid:durableId="1028675536">
     <w:abstractNumId w:val="6"/>
   </w:num>
-  <w:num w:numId="3" w16cid:durableId="1640112336">
+  <w:num w:numId="3" w16cid:durableId="1810592077">
     <w:abstractNumId w:val="5"/>
   </w:num>
-  <w:num w:numId="4" w16cid:durableId="464931566">
+  <w:num w:numId="4" w16cid:durableId="1500077883">
     <w:abstractNumId w:val="4"/>
   </w:num>
-  <w:num w:numId="5" w16cid:durableId="1766458254">
+  <w:num w:numId="5" w16cid:durableId="1366323571">
     <w:abstractNumId w:val="7"/>
   </w:num>
-  <w:num w:numId="6" w16cid:durableId="138690962">
+  <w:num w:numId="6" w16cid:durableId="1435202350">
     <w:abstractNumId w:val="3"/>
   </w:num>
-  <w:num w:numId="7" w16cid:durableId="610866498">
+  <w:num w:numId="7" w16cid:durableId="146023439">
     <w:abstractNumId w:val="2"/>
   </w:num>
-  <w:num w:numId="8" w16cid:durableId="127206773">
+  <w:num w:numId="8" w16cid:durableId="1389913139">
     <w:abstractNumId w:val="1"/>
   </w:num>
-  <w:num w:numId="9" w16cid:durableId="660084108">
+  <w:num w:numId="9" w16cid:durableId="902443845">
     <w:abstractNumId w:val="0"/>
   </w:num>
 </w:numbering>
@@ -26590,7 +26590,7 @@
     <w:autoRedefine/>
     <w:uiPriority w:val="39"/>
     <w:unhideWhenUsed/>
-    <w:rsid w:val="003F4A32"/>
+    <w:rsid w:val="0015796D"/>
     <w:pPr>
       <w:spacing w:after="100"/>
     </w:pPr>
@@ -26602,7 +26602,7 @@
     <w:autoRedefine/>
     <w:uiPriority w:val="39"/>
     <w:unhideWhenUsed/>
-    <w:rsid w:val="003F4A32"/>
+    <w:rsid w:val="0015796D"/>
     <w:pPr>
       <w:spacing w:after="100"/>
       <w:ind w:left="220"/>
@@ -26613,7 +26613,7 @@
     <w:basedOn w:val="DefaultParagraphFont"/>
     <w:uiPriority w:val="99"/>
     <w:unhideWhenUsed/>
-    <w:rsid w:val="003F4A32"/>
+    <w:rsid w:val="0015796D"/>
     <w:rPr>
       <w:color w:val="0000FF" w:themeColor="hyperlink"/>
       <w:u w:val="single"/>

</xml_diff>